<commit_message>
Add GOST front-matter deliverables (title, TOC, definitions, abbreviations, normative refs) + full dissertation bundles EN/KZ
Co-Authored-By: Claude Opus 4.8 <noreply@anthropic.com>
</commit_message>
<xml_diff>
--- a/defense/docs/abstract_en.docx
+++ b/defense/docs/abstract_en.docx
@@ -30,7 +30,7 @@
           <w:i w:val="0"/>
           <w:sz w:val="28"/>
         </w:rPr>
-        <w:t>of the dissertation work by Yesmukhamedov Nurmaganbet Seitkaliuly titled "Automated Diabetic Retinopathy Diagnosis via Fundus Image Enhancement and CNN Classification", submitted for the degree of Doctor of Philosophy (PhD) in the educational programme 8D06104 — Computer systems and software engineering</w:t>
+        <w:t>of the PhD thesis by Yesmukhamedov Nurmaganbet Seitkaliuly on «Automated Diabetic Retinopathy Diagnosis via Fundus Image Enhancement and CNN Classification», submitted for the degree of Doctor of Philosophy (PhD) in the educational programme (EP) 8D06104 — Computer systems and software engineering</w:t>
       </w:r>
     </w:p>
     <w:p>
@@ -39,6 +39,37 @@
           <w:bottom w:val="single" w:sz="6" w:space="1" w:color="auto"/>
         </w:pBdr>
       </w:pPr>
+    </w:p>
+    <w:p>
+      <w:pPr>
+        <w:keepNext/>
+        <w:spacing w:before="240" w:after="120"/>
+        <w:jc w:val="left"/>
+      </w:pPr>
+      <w:r>
+        <w:rPr>
+          <w:rFonts w:ascii="Times New Roman" w:hAnsi="Times New Roman" w:cs="Times New Roman" w:eastAsia="Times New Roman"/>
+          <w:b/>
+          <w:i w:val="0"/>
+          <w:sz w:val="28"/>
+        </w:rPr>
+        <w:t>General characteristics of the research</w:t>
+      </w:r>
+    </w:p>
+    <w:p>
+      <w:pPr>
+        <w:ind w:firstLine="709"/>
+        <w:jc w:val="both"/>
+      </w:pPr>
+      <w:r>
+        <w:rPr>
+          <w:rFonts w:ascii="Times New Roman" w:hAnsi="Times New Roman" w:cs="Times New Roman" w:eastAsia="Times New Roman"/>
+          <w:b w:val="0"/>
+          <w:i w:val="0"/>
+          <w:sz w:val="28"/>
+        </w:rPr>
+        <w:t>This dissertation investigates and formalises the integration of fundus image enhancement (preprocessing) with convolutional-neural-network (CNN) classification for automated multi-stage diabetic retinopathy (DR) diagnosis. Its central idea is that preprocessing is an integral component of the diagnostic model rather than ancillary data preparation, because it defines the feature space available to the network. To operationalise this idea, an 8-stage preprocessing pipeline is specified and embedded in the model, and its effect is placed under a controlled experimental contrast against an equivalent baseline trained without the pipeline. The approach is validated across eight public and clinical fundus datasets acquired with cameras of four manufacturers, covering diagnostic dominance, component ablation, cross-dataset transfer, explainability, clinical degradation resistance, and device domain shift, and is oriented towards automated DR screening in resource-limited settings, including the healthcare infrastructure of Kazakhstan.</w:t>
+      </w:r>
     </w:p>
     <w:p>
       <w:pPr>
@@ -392,6 +423,37 @@
           <w:i w:val="0"/>
           <w:sz w:val="28"/>
         </w:rPr>
+        <w:t>Empirical (experimental) basis</w:t>
+      </w:r>
+    </w:p>
+    <w:p>
+      <w:pPr>
+        <w:ind w:firstLine="709"/>
+        <w:jc w:val="both"/>
+      </w:pPr>
+      <w:r>
+        <w:rPr>
+          <w:rFonts w:ascii="Times New Roman" w:hAnsi="Times New Roman" w:cs="Times New Roman" w:eastAsia="Times New Roman"/>
+          <w:b w:val="0"/>
+          <w:i w:val="0"/>
+          <w:sz w:val="28"/>
+        </w:rPr>
+        <w:t>Eight datasets organised into functional tiers: EyePACS (~35,126 images, primary training and ablation, Canon CR-1); APTOS 2019 (~3,662, cross-dataset transfer); IDRiD (516 images, 81 with pixel-level lesion masks, clinical validation and explainability, Kowa); Messidor-2 (~1,748, clinical degradation, Topcon); DDR (~13,673, device shift, Canon/Topcon); ODIR-5K (~5,000, device shift, Canon/Zeiss); RFMiD (~3,200, device shift, Topcon/Kowa); and a Kazakh clinical dataset (60 images, 30 patients × 2 eyes, balanced, qualitative validation). Image quality is evaluated with CNR, VVI, entropy, and SSIM.</w:t>
+      </w:r>
+    </w:p>
+    <w:p>
+      <w:pPr>
+        <w:keepNext/>
+        <w:spacing w:before="240" w:after="120"/>
+        <w:jc w:val="left"/>
+      </w:pPr>
+      <w:r>
+        <w:rPr>
+          <w:rFonts w:ascii="Times New Roman" w:hAnsi="Times New Roman" w:cs="Times New Roman" w:eastAsia="Times New Roman"/>
+          <w:b/>
+          <w:i w:val="0"/>
+          <w:sz w:val="28"/>
+        </w:rPr>
         <w:t>Scientific novelty</w:t>
       </w:r>
     </w:p>
@@ -512,124 +574,6 @@
         <w:t>7.</w:t>
         <w:tab/>
         <w:t>The integrated pipeline is validated across a multi-dataset, multi-device architecture (EyePACS, APTOS 2019, IDRiD, Messidor-2, DDR, ODIR-5K, RFMiD, and a Kazakh clinical dataset), including cross-dataset transfer, clinical degradation resistance, and device domain shift across four camera manufacturers (Canon, Topcon, Kowa, Zeiss).</w:t>
-      </w:r>
-    </w:p>
-    <w:p>
-      <w:pPr>
-        <w:keepNext/>
-        <w:spacing w:before="240" w:after="120"/>
-        <w:jc w:val="left"/>
-      </w:pPr>
-      <w:r>
-        <w:rPr>
-          <w:rFonts w:ascii="Times New Roman" w:hAnsi="Times New Roman" w:cs="Times New Roman" w:eastAsia="Times New Roman"/>
-          <w:b/>
-          <w:i w:val="0"/>
-          <w:sz w:val="28"/>
-        </w:rPr>
-        <w:t>Statements submitted for defense</w:t>
-      </w:r>
-    </w:p>
-    <w:p>
-      <w:pPr>
-        <w:ind w:left="709" w:hanging="397"/>
-        <w:jc w:val="both"/>
-      </w:pPr>
-      <w:r>
-        <w:rPr>
-          <w:rFonts w:ascii="Times New Roman" w:hAnsi="Times New Roman" w:cs="Times New Roman" w:eastAsia="Times New Roman"/>
-          <w:b w:val="0"/>
-          <w:i w:val="0"/>
-          <w:sz w:val="28"/>
-        </w:rPr>
-        <w:t>1.</w:t>
-        <w:tab/>
-        <w:t>Preprocessing is an integral component of the diagnostic model, not ancillary data preparation: the integrated configuration (8-stage pipeline + in-domain pretraining) achieves statistically significant dominance in five-class DR classification over an equivalent baseline configuration (stretch-resize + ImageNet normalisation), satisfying the pre-registered dominance criterion for both ResNet-50 and EfficientNet-B3 (H-1).</w:t>
-      </w:r>
-    </w:p>
-    <w:p>
-      <w:pPr>
-        <w:ind w:left="709" w:hanging="397"/>
-        <w:jc w:val="both"/>
-      </w:pPr>
-      <w:r>
-        <w:rPr>
-          <w:rFonts w:ascii="Times New Roman" w:hAnsi="Times New Roman" w:cs="Times New Roman" w:eastAsia="Times New Roman"/>
-          <w:b w:val="0"/>
-          <w:i w:val="0"/>
-          <w:sz w:val="28"/>
-        </w:rPr>
-        <w:t>2.</w:t>
-        <w:tab/>
-        <w:t>The contribution of individual pipeline stages can be quantified by component ablation, and the dual-constraint CLAHE clip-limit and the flat-field σ exhibit identifiable sensitivity profiles with a local optimum within the tested range (H-2).</w:t>
-      </w:r>
-    </w:p>
-    <w:p>
-      <w:pPr>
-        <w:ind w:left="709" w:hanging="397"/>
-        <w:jc w:val="both"/>
-      </w:pPr>
-      <w:r>
-        <w:rPr>
-          <w:rFonts w:ascii="Times New Roman" w:hAnsi="Times New Roman" w:cs="Times New Roman" w:eastAsia="Times New Roman"/>
-          <w:b w:val="0"/>
-          <w:i w:val="0"/>
-          <w:sz w:val="28"/>
-        </w:rPr>
-        <w:t>3.</w:t>
-        <w:tab/>
-        <w:t>A model trained on EyePACS with the pipeline transfers to APTOS 2019 without retraining, achieving a generalisation ratio G = F1_APTOS / F1_EyePACS ≥ 0.85 (H-4).</w:t>
-      </w:r>
-    </w:p>
-    <w:p>
-      <w:pPr>
-        <w:ind w:left="709" w:hanging="397"/>
-        <w:jc w:val="both"/>
-      </w:pPr>
-      <w:r>
-        <w:rPr>
-          <w:rFonts w:ascii="Times New Roman" w:hAnsi="Times New Roman" w:cs="Times New Roman" w:eastAsia="Times New Roman"/>
-          <w:b w:val="0"/>
-          <w:i w:val="0"/>
-          <w:sz w:val="28"/>
-        </w:rPr>
-        <w:t>4.</w:t>
-        <w:tab/>
-        <w:t>The pipeline redirects CNN attention toward clinically relevant lesion regions, demonstrated quantitatively by higher ALO (primary) and IoU (secondary) against IDRiD lesion masks and qualitatively by Grad-CAM overlays on a Kazakh clinical dataset (H-5).</w:t>
-      </w:r>
-    </w:p>
-    <w:p>
-      <w:pPr>
-        <w:ind w:left="709" w:hanging="397"/>
-        <w:jc w:val="both"/>
-      </w:pPr>
-      <w:r>
-        <w:rPr>
-          <w:rFonts w:ascii="Times New Roman" w:hAnsi="Times New Roman" w:cs="Times New Roman" w:eastAsia="Times New Roman"/>
-          <w:b w:val="0"/>
-          <w:i w:val="0"/>
-          <w:sz w:val="28"/>
-        </w:rPr>
-        <w:t>5.</w:t>
-        <w:tab/>
-        <w:t>The pipeline reduces cross-dataset performance degradation Δ = F1_EyePACS_val − F1_external on IDRiD and Messidor-2 relative to the baseline (H-7).</w:t>
-      </w:r>
-    </w:p>
-    <w:p>
-      <w:pPr>
-        <w:ind w:left="709" w:hanging="397"/>
-        <w:jc w:val="both"/>
-      </w:pPr>
-      <w:r>
-        <w:rPr>
-          <w:rFonts w:ascii="Times New Roman" w:hAnsi="Times New Roman" w:cs="Times New Roman" w:eastAsia="Times New Roman"/>
-          <w:b w:val="0"/>
-          <w:i w:val="0"/>
-          <w:sz w:val="28"/>
-        </w:rPr>
-        <w:t>6.</w:t>
-        <w:tab/>
-        <w:t>The pipeline maintains classification performance across images from different fundus camera manufacturers (Canon, Topcon, Kowa, Zeiss) within acceptable bounds relative to in-domain performance (H-6).</w:t>
       </w:r>
     </w:p>
     <w:p>
@@ -797,6 +741,124 @@
           <w:i w:val="0"/>
           <w:sz w:val="28"/>
         </w:rPr>
+        <w:t>Statements submitted for defense</w:t>
+      </w:r>
+    </w:p>
+    <w:p>
+      <w:pPr>
+        <w:ind w:left="709" w:hanging="397"/>
+        <w:jc w:val="both"/>
+      </w:pPr>
+      <w:r>
+        <w:rPr>
+          <w:rFonts w:ascii="Times New Roman" w:hAnsi="Times New Roman" w:cs="Times New Roman" w:eastAsia="Times New Roman"/>
+          <w:b w:val="0"/>
+          <w:i w:val="0"/>
+          <w:sz w:val="28"/>
+        </w:rPr>
+        <w:t>1.</w:t>
+        <w:tab/>
+        <w:t>Preprocessing is an integral component of the diagnostic model, not ancillary data preparation: the integrated configuration (8-stage pipeline + in-domain pretraining) achieves statistically significant dominance in five-class DR classification over an equivalent baseline configuration (stretch-resize + ImageNet normalisation), satisfying the pre-registered dominance criterion for both ResNet-50 and EfficientNet-B3 (H-1).</w:t>
+      </w:r>
+    </w:p>
+    <w:p>
+      <w:pPr>
+        <w:ind w:left="709" w:hanging="397"/>
+        <w:jc w:val="both"/>
+      </w:pPr>
+      <w:r>
+        <w:rPr>
+          <w:rFonts w:ascii="Times New Roman" w:hAnsi="Times New Roman" w:cs="Times New Roman" w:eastAsia="Times New Roman"/>
+          <w:b w:val="0"/>
+          <w:i w:val="0"/>
+          <w:sz w:val="28"/>
+        </w:rPr>
+        <w:t>2.</w:t>
+        <w:tab/>
+        <w:t>The contribution of individual pipeline stages can be quantified by component ablation, and the dual-constraint CLAHE clip-limit and the flat-field σ exhibit identifiable sensitivity profiles with a local optimum within the tested range (H-2).</w:t>
+      </w:r>
+    </w:p>
+    <w:p>
+      <w:pPr>
+        <w:ind w:left="709" w:hanging="397"/>
+        <w:jc w:val="both"/>
+      </w:pPr>
+      <w:r>
+        <w:rPr>
+          <w:rFonts w:ascii="Times New Roman" w:hAnsi="Times New Roman" w:cs="Times New Roman" w:eastAsia="Times New Roman"/>
+          <w:b w:val="0"/>
+          <w:i w:val="0"/>
+          <w:sz w:val="28"/>
+        </w:rPr>
+        <w:t>3.</w:t>
+        <w:tab/>
+        <w:t>A model trained on EyePACS with the pipeline transfers to APTOS 2019 without retraining, achieving a generalisation ratio G = F1_APTOS / F1_EyePACS ≥ 0.85 (H-4).</w:t>
+      </w:r>
+    </w:p>
+    <w:p>
+      <w:pPr>
+        <w:ind w:left="709" w:hanging="397"/>
+        <w:jc w:val="both"/>
+      </w:pPr>
+      <w:r>
+        <w:rPr>
+          <w:rFonts w:ascii="Times New Roman" w:hAnsi="Times New Roman" w:cs="Times New Roman" w:eastAsia="Times New Roman"/>
+          <w:b w:val="0"/>
+          <w:i w:val="0"/>
+          <w:sz w:val="28"/>
+        </w:rPr>
+        <w:t>4.</w:t>
+        <w:tab/>
+        <w:t>The pipeline redirects CNN attention toward clinically relevant lesion regions, demonstrated quantitatively by higher ALO (primary) and IoU (secondary) against IDRiD lesion masks and qualitatively by Grad-CAM overlays on a Kazakh clinical dataset (H-5).</w:t>
+      </w:r>
+    </w:p>
+    <w:p>
+      <w:pPr>
+        <w:ind w:left="709" w:hanging="397"/>
+        <w:jc w:val="both"/>
+      </w:pPr>
+      <w:r>
+        <w:rPr>
+          <w:rFonts w:ascii="Times New Roman" w:hAnsi="Times New Roman" w:cs="Times New Roman" w:eastAsia="Times New Roman"/>
+          <w:b w:val="0"/>
+          <w:i w:val="0"/>
+          <w:sz w:val="28"/>
+        </w:rPr>
+        <w:t>5.</w:t>
+        <w:tab/>
+        <w:t>The pipeline reduces cross-dataset performance degradation Δ = F1_EyePACS_val − F1_external on IDRiD and Messidor-2 relative to the baseline (H-7).</w:t>
+      </w:r>
+    </w:p>
+    <w:p>
+      <w:pPr>
+        <w:ind w:left="709" w:hanging="397"/>
+        <w:jc w:val="both"/>
+      </w:pPr>
+      <w:r>
+        <w:rPr>
+          <w:rFonts w:ascii="Times New Roman" w:hAnsi="Times New Roman" w:cs="Times New Roman" w:eastAsia="Times New Roman"/>
+          <w:b w:val="0"/>
+          <w:i w:val="0"/>
+          <w:sz w:val="28"/>
+        </w:rPr>
+        <w:t>6.</w:t>
+        <w:tab/>
+        <w:t>The pipeline maintains classification performance across images from different fundus camera manufacturers (Canon, Topcon, Kowa, Zeiss) within acceptable bounds relative to in-domain performance (H-6).</w:t>
+      </w:r>
+    </w:p>
+    <w:p>
+      <w:pPr>
+        <w:keepNext/>
+        <w:spacing w:before="240" w:after="120"/>
+        <w:jc w:val="left"/>
+      </w:pPr>
+      <w:r>
+        <w:rPr>
+          <w:rFonts w:ascii="Times New Roman" w:hAnsi="Times New Roman" w:cs="Times New Roman" w:eastAsia="Times New Roman"/>
+          <w:b/>
+          <w:i w:val="0"/>
+          <w:sz w:val="28"/>
+        </w:rPr>
         <w:t>Theoretical significance</w:t>
       </w:r>
     </w:p>
@@ -899,37 +961,6 @@
           <w:i w:val="0"/>
           <w:sz w:val="28"/>
         </w:rPr>
-        <w:t>Empirical (experimental) basis</w:t>
-      </w:r>
-    </w:p>
-    <w:p>
-      <w:pPr>
-        <w:ind w:firstLine="709"/>
-        <w:jc w:val="both"/>
-      </w:pPr>
-      <w:r>
-        <w:rPr>
-          <w:rFonts w:ascii="Times New Roman" w:hAnsi="Times New Roman" w:cs="Times New Roman" w:eastAsia="Times New Roman"/>
-          <w:b w:val="0"/>
-          <w:i w:val="0"/>
-          <w:sz w:val="28"/>
-        </w:rPr>
-        <w:t>Eight datasets organised into functional tiers: EyePACS (~35,126 images, primary training and ablation, Canon CR-1); APTOS 2019 (~3,662, cross-dataset transfer); IDRiD (516 images, 81 with pixel-level lesion masks, clinical validation and explainability, Kowa); Messidor-2 (~1,748, clinical degradation, Topcon); DDR (~13,673, device shift, Canon/Topcon); ODIR-5K (~5,000, device shift, Canon/Zeiss); RFMiD (~3,200, device shift, Topcon/Kowa); and a Kazakh clinical dataset (60 images, 30 patients × 2 eyes, balanced, qualitative validation). Image quality is evaluated with CNR, VVI, entropy, and SSIM.</w:t>
-      </w:r>
-    </w:p>
-    <w:p>
-      <w:pPr>
-        <w:keepNext/>
-        <w:spacing w:before="240" w:after="120"/>
-        <w:jc w:val="left"/>
-      </w:pPr>
-      <w:r>
-        <w:rPr>
-          <w:rFonts w:ascii="Times New Roman" w:hAnsi="Times New Roman" w:cs="Times New Roman" w:eastAsia="Times New Roman"/>
-          <w:b/>
-          <w:i w:val="0"/>
-          <w:sz w:val="28"/>
-        </w:rPr>
         <w:t>Approbation of the results and connection with scientific programmes</w:t>
       </w:r>
     </w:p>
@@ -945,7 +976,22 @@
           <w:i w:val="0"/>
           <w:sz w:val="28"/>
         </w:rPr>
-        <w:t>The results of the research were reported and discussed at international scientific forums, including the 3rd International Workshop on Digital Society (DS 2025, Istanbul, Türkiye, 28–30 October 2025), and published in international peer-reviewed journals. The research direction corresponds to the priorities of the digitalisation of healthcare and the development of artificial-intelligence technologies of the Republic of Kazakhstan (in accordance with subpara. 2, para. 3, art. 20 of the Law of the Republic of Kazakhstan "On Science").</w:t>
+        <w:t>The results of the research were reported and discussed at international scientific forums, including the 3rd International Workshop on Digital Society (DS 2025, Istanbul, Türkiye, 28–30 October 2025), and published in international peer-reviewed journals.</w:t>
+      </w:r>
+    </w:p>
+    <w:p>
+      <w:pPr>
+        <w:ind w:firstLine="709"/>
+        <w:jc w:val="both"/>
+      </w:pPr>
+      <w:r>
+        <w:rPr>
+          <w:rFonts w:ascii="Times New Roman" w:hAnsi="Times New Roman" w:cs="Times New Roman" w:eastAsia="Times New Roman"/>
+          <w:b w:val="0"/>
+          <w:i w:val="0"/>
+          <w:sz w:val="28"/>
+        </w:rPr>
+        <w:t>The research direction corresponds to the state priorities of healthcare digitalisation and the development of artificial-intelligence technologies of the Republic of Kazakhstan, in particular: the Concept for the Development of Artificial Intelligence for 2024–2029; the Address of the President of the Republic of Kazakhstan «Kazakhstan in the Era of Artificial Intelligence» (8 September 2025); and the Law of the Republic of Kazakhstan «On Artificial Intelligence» (No. 230-VIII, 17 November 2025). The work is carried out in accordance with subpara. 2, para. 3, art. 20 of the Law of the Republic of Kazakhstan «On Science».</w:t>
       </w:r>
     </w:p>
     <w:p>
@@ -1066,392 +1112,7 @@
           <w:i w:val="0"/>
           <w:sz w:val="28"/>
         </w:rPr>
-        <w:t>). See the List of published works below.</w:t>
-      </w:r>
-    </w:p>
-    <w:p>
-      <w:pPr>
-        <w:keepNext/>
-        <w:spacing w:before="240" w:after="120"/>
-        <w:jc w:val="left"/>
-      </w:pPr>
-      <w:r>
-        <w:rPr>
-          <w:rFonts w:ascii="Times New Roman" w:hAnsi="Times New Roman" w:cs="Times New Roman" w:eastAsia="Times New Roman"/>
-          <w:b/>
-          <w:i w:val="0"/>
-          <w:sz w:val="28"/>
-        </w:rPr>
-        <w:t>Structure and length of the dissertation</w:t>
-      </w:r>
-    </w:p>
-    <w:p>
-      <w:pPr>
-        <w:ind w:firstLine="709"/>
-        <w:jc w:val="both"/>
-      </w:pPr>
-      <w:r>
-        <w:rPr>
-          <w:rFonts w:ascii="Times New Roman" w:hAnsi="Times New Roman" w:cs="Times New Roman" w:eastAsia="Times New Roman"/>
-          <w:b w:val="0"/>
-          <w:i w:val="0"/>
-          <w:sz w:val="28"/>
-        </w:rPr>
-        <w:t>The dissertation consists of an introduction, six chapters, a conclusion, a list of references used, and appendices. The work is supplemented with tables, figures, and the source code of the preprocessing pipeline.</w:t>
-      </w:r>
-    </w:p>
-    <w:p>
-      <w:pPr>
-        <w:pBdr>
-          <w:bottom w:val="single" w:sz="6" w:space="1" w:color="auto"/>
-        </w:pBdr>
-      </w:pPr>
-    </w:p>
-    <w:p>
-      <w:pPr>
-        <w:keepNext/>
-        <w:spacing w:before="240" w:after="120"/>
-        <w:jc w:val="center"/>
-      </w:pPr>
-      <w:r>
-        <w:rPr>
-          <w:rFonts w:ascii="Times New Roman" w:hAnsi="Times New Roman" w:cs="Times New Roman" w:eastAsia="Times New Roman"/>
-          <w:b/>
-          <w:i w:val="0"/>
-          <w:sz w:val="32"/>
-        </w:rPr>
-        <w:t>MAIN CONTENT OF THE WORK</w:t>
-      </w:r>
-    </w:p>
-    <w:p>
-      <w:pPr>
-        <w:ind w:firstLine="709"/>
-        <w:jc w:val="both"/>
-      </w:pPr>
-      <w:r>
-        <w:rPr>
-          <w:rFonts w:ascii="Times New Roman" w:hAnsi="Times New Roman" w:cs="Times New Roman" w:eastAsia="Times New Roman"/>
-          <w:b/>
-          <w:i w:val="0"/>
-          <w:sz w:val="28"/>
-        </w:rPr>
-        <w:t>The introduction</w:t>
-      </w:r>
-      <w:r>
-        <w:rPr>
-          <w:rFonts w:ascii="Times New Roman" w:hAnsi="Times New Roman" w:cs="Times New Roman" w:eastAsia="Times New Roman"/>
-          <w:b w:val="0"/>
-          <w:i w:val="0"/>
-          <w:sz w:val="28"/>
-        </w:rPr>
-        <w:t xml:space="preserve"> substantiates the relevance of the topic, formulates the aim, objectives, object and subject of the research, the central hypothesis, the scientific novelty, the statements submitted for defense, the methodological basis, the theoretical and practical significance, the reliability of the results, the empirical basis, the approbation, the connection with scientific programmes, and the publications, and describes the structure and length of the dissertation.</w:t>
-      </w:r>
-    </w:p>
-    <w:p>
-      <w:pPr>
-        <w:ind w:firstLine="709"/>
-        <w:jc w:val="both"/>
-      </w:pPr>
-      <w:r>
-        <w:rPr>
-          <w:rFonts w:ascii="Times New Roman" w:hAnsi="Times New Roman" w:cs="Times New Roman" w:eastAsia="Times New Roman"/>
-          <w:b/>
-          <w:i w:val="0"/>
-          <w:sz w:val="28"/>
-        </w:rPr>
-        <w:t>Chapter 1 — "Problem Domain Analysis and Current State of Automated Diabetic Retinopathy Diagnosis"</w:t>
-      </w:r>
-      <w:r>
-        <w:rPr>
-          <w:rFonts w:ascii="Times New Roman" w:hAnsi="Times New Roman" w:cs="Times New Roman" w:eastAsia="Times New Roman"/>
-          <w:b w:val="0"/>
-          <w:i w:val="0"/>
-          <w:sz w:val="28"/>
-        </w:rPr>
-        <w:t xml:space="preserve"> examines the medical and epidemiological context of DR and its clinical grading, the screening requirements of resource-limited settings, the sources of fundus image quality degradation and device-specific variability, deep-learning approaches to retinal image classification (CNN architectures, transfer and self-supervised pretraining, explainability), and provides a critical analysis of existing automated DR screening systems, concluding with the formulation of the research problem and the justification of the research direction.</w:t>
-      </w:r>
-    </w:p>
-    <w:p>
-      <w:pPr>
-        <w:ind w:firstLine="709"/>
-        <w:jc w:val="both"/>
-      </w:pPr>
-      <w:r>
-        <w:rPr>
-          <w:rFonts w:ascii="Times New Roman" w:hAnsi="Times New Roman" w:cs="Times New Roman" w:eastAsia="Times New Roman"/>
-          <w:b/>
-          <w:i w:val="0"/>
-          <w:sz w:val="28"/>
-        </w:rPr>
-        <w:t>Chapter 2 — "Theoretical Foundations of Image Preprocessing and Deep Learning for Fundus Image Analysis"</w:t>
-      </w:r>
-      <w:r>
-        <w:rPr>
-          <w:rFonts w:ascii="Times New Roman" w:hAnsi="Times New Roman" w:cs="Times New Roman" w:eastAsia="Times New Roman"/>
-          <w:b w:val="0"/>
-          <w:i w:val="0"/>
-          <w:sz w:val="28"/>
-        </w:rPr>
-        <w:t xml:space="preserve"> establishes the mathematical foundations of image enhancement (histogram equalisation, dual-constraint CLAHE, spatial filtering), the theoretical framework of CNNs (convolution, pooling, loss functions for imbalanced data, regularisation), transfer and in-domain self-supervised representation learning, the mathematical modelling of laser-tissue interaction in retinal therapy, explainability (CAM, Grad-CAM, ALO, IoU), and image quality metrics for preprocessing evaluation.</w:t>
-      </w:r>
-    </w:p>
-    <w:p>
-      <w:pPr>
-        <w:ind w:firstLine="709"/>
-        <w:jc w:val="both"/>
-      </w:pPr>
-      <w:r>
-        <w:rPr>
-          <w:rFonts w:ascii="Times New Roman" w:hAnsi="Times New Roman" w:cs="Times New Roman" w:eastAsia="Times New Roman"/>
-          <w:b/>
-          <w:i w:val="0"/>
-          <w:sz w:val="28"/>
-        </w:rPr>
-        <w:t>Chapter 3 — "Methodology of Integrated Preprocessing-CNN Pipeline Design"</w:t>
-      </w:r>
-      <w:r>
-        <w:rPr>
-          <w:rFonts w:ascii="Times New Roman" w:hAnsi="Times New Roman" w:cs="Times New Roman" w:eastAsia="Times New Roman"/>
-          <w:b w:val="0"/>
-          <w:i w:val="0"/>
-          <w:sz w:val="28"/>
-        </w:rPr>
-        <w:t xml:space="preserve"> formalises the unified 8-stage preprocessing pipeline and the modified dual-constraint CLAHE algorithm, the augmentation strategy, and the external image ingestion protocol; specifies the CNN architectures (ResNet-50 and EfficientNet-B3); details the transfer-learning and ophthalmology-specific self-supervised pretraining methodology, the architecture adaptation for five-class classification, and the weighted (Focal) loss formulation; and defines the multi-metric evaluation and statistical reliability framework.</w:t>
-      </w:r>
-    </w:p>
-    <w:p>
-      <w:pPr>
-        <w:ind w:firstLine="709"/>
-        <w:jc w:val="both"/>
-      </w:pPr>
-      <w:r>
-        <w:rPr>
-          <w:rFonts w:ascii="Times New Roman" w:hAnsi="Times New Roman" w:cs="Times New Roman" w:eastAsia="Times New Roman"/>
-          <w:b/>
-          <w:i w:val="0"/>
-          <w:sz w:val="28"/>
-        </w:rPr>
-        <w:t>Chapter 4 — "Experimental Research — Preprocessing Impact on CNN Diagnostic Performance"</w:t>
-      </w:r>
-      <w:r>
-        <w:rPr>
-          <w:rFonts w:ascii="Times New Roman" w:hAnsi="Times New Roman" w:cs="Times New Roman" w:eastAsia="Times New Roman"/>
-          <w:b w:val="0"/>
-          <w:i w:val="0"/>
-          <w:sz w:val="28"/>
-        </w:rPr>
-        <w:t xml:space="preserve"> presents the tiered dataset architecture and the seven experiments: Experiment 1 (integrated-pipeline dominance via a restored 2×2 factorial, configs A–D), Experiment 2 ( stage ablation across 7 levels, CLAHE threshold and flat-field σ sweeps with image-quality metrics), Experiment 3 (zero-shot cross-dataset transfer to APTOS 2019), Experiment 4 (Grad-CAM explainability with quantitative ALO/IoU on IDRiD and qualitative overlays on the Clinical dataset), Experiment 5 (clinical degradation resistance on IDRiD and Messidor-2), Experiment 6 (device domain shift on DDR, ODIR-5K, RFMiD), and Experiment 7 (small-data training on IDRiD with the Clinical dataset held out).</w:t>
-      </w:r>
-    </w:p>
-    <w:p>
-      <w:pPr>
-        <w:ind w:firstLine="709"/>
-        <w:jc w:val="both"/>
-      </w:pPr>
-      <w:r>
-        <w:rPr>
-          <w:rFonts w:ascii="Times New Roman" w:hAnsi="Times New Roman" w:cs="Times New Roman" w:eastAsia="Times New Roman"/>
-          <w:b/>
-          <w:i w:val="0"/>
-          <w:sz w:val="28"/>
-        </w:rPr>
-        <w:t>Chapter 5 — "Reliability Validation and Comparative Analysis"</w:t>
-      </w:r>
-      <w:r>
-        <w:rPr>
-          <w:rFonts w:ascii="Times New Roman" w:hAnsi="Times New Roman" w:cs="Times New Roman" w:eastAsia="Times New Roman"/>
-          <w:b w:val="0"/>
-          <w:i w:val="0"/>
-          <w:sz w:val="28"/>
-        </w:rPr>
-        <w:t xml:space="preserve"> consolidates the explainability results, the statistical validation (bootstrap confidence intervals and mixed-effects modelling, final claim-strength classifications), the comparative analysis against published systems (IDx-DR, Eyenuk, DeepMind) and the performance-complexity trade-off, and states the limitations and boundary conditions of the proposed approach.</w:t>
-      </w:r>
-    </w:p>
-    <w:p>
-      <w:pPr>
-        <w:ind w:firstLine="709"/>
-        <w:jc w:val="both"/>
-      </w:pPr>
-      <w:r>
-        <w:rPr>
-          <w:rFonts w:ascii="Times New Roman" w:hAnsi="Times New Roman" w:cs="Times New Roman" w:eastAsia="Times New Roman"/>
-          <w:b/>
-          <w:i w:val="0"/>
-          <w:sz w:val="28"/>
-        </w:rPr>
-        <w:t>Chapter 6 — "Architecture of an Automated DR Screening System for Resource-Limited Environments"</w:t>
-      </w:r>
-      <w:r>
-        <w:rPr>
-          <w:rFonts w:ascii="Times New Roman" w:hAnsi="Times New Roman" w:cs="Times New Roman" w:eastAsia="Times New Roman"/>
-          <w:b w:val="0"/>
-          <w:i w:val="0"/>
-          <w:sz w:val="28"/>
-        </w:rPr>
-        <w:t xml:space="preserve"> specifies the functional and non-functional requirements, the modular architecture with PACS and EHR integration, the AI processing module (configurable preprocessing engine and inference module), clinical workflow integration (telemedicine, portable-device and national eHealth-platform support, physician-in-the-loop decision support), and the data security and regulatory-compliance framework (GDPR/HIPAA-aligned), with its applicability to Kazakhstan healthcare infrastructure.</w:t>
-      </w:r>
-    </w:p>
-    <w:p>
-      <w:pPr>
-        <w:pBdr>
-          <w:bottom w:val="single" w:sz="6" w:space="1" w:color="auto"/>
-        </w:pBdr>
-      </w:pPr>
-    </w:p>
-    <w:p>
-      <w:pPr>
-        <w:keepNext/>
-        <w:spacing w:before="240" w:after="120"/>
-        <w:jc w:val="center"/>
-      </w:pPr>
-      <w:r>
-        <w:rPr>
-          <w:rFonts w:ascii="Times New Roman" w:hAnsi="Times New Roman" w:cs="Times New Roman" w:eastAsia="Times New Roman"/>
-          <w:b/>
-          <w:i w:val="0"/>
-          <w:sz w:val="32"/>
-        </w:rPr>
-        <w:t>CONCLUSION</w:t>
-      </w:r>
-    </w:p>
-    <w:p>
-      <w:pPr>
-        <w:ind w:left="709" w:hanging="397"/>
-        <w:jc w:val="both"/>
-      </w:pPr>
-      <w:r>
-        <w:rPr>
-          <w:rFonts w:ascii="Times New Roman" w:hAnsi="Times New Roman" w:cs="Times New Roman" w:eastAsia="Times New Roman"/>
-          <w:b w:val="0"/>
-          <w:i w:val="0"/>
-          <w:sz w:val="28"/>
-        </w:rPr>
-        <w:t>1.</w:t>
-        <w:tab/>
-        <w:t>Preprocessing was formalised as an integral component of the diagnostic model (paradigm P2) through an 8-stage pipeline, and the hypothesis of integrated-pipeline dominance was placed under controlled experimental contrast against the baseline (paradigm P1) on EyePACS, providing an empirical comparison of the two paradigms under otherwise matched conditions.</w:t>
-      </w:r>
-    </w:p>
-    <w:p>
-      <w:pPr>
-        <w:ind w:left="709" w:hanging="397"/>
-        <w:jc w:val="both"/>
-      </w:pPr>
-      <w:r>
-        <w:rPr>
-          <w:rFonts w:ascii="Times New Roman" w:hAnsi="Times New Roman" w:cs="Times New Roman" w:eastAsia="Times New Roman"/>
-          <w:b w:val="0"/>
-          <w:i w:val="0"/>
-          <w:sz w:val="28"/>
-        </w:rPr>
-        <w:t>2.</w:t>
-        <w:tab/>
-        <w:t>A component-ablation analysis quantified the contribution of the individual pipeline stages, and the dual-constraint CLAHE and adaptive flat-field correction were characterised by parameter sweeps with identifiable optima, supported by image-quality metrics (CNR, VVI, entropy, SSIM).</w:t>
-      </w:r>
-    </w:p>
-    <w:p>
-      <w:pPr>
-        <w:ind w:left="709" w:hanging="397"/>
-        <w:jc w:val="both"/>
-      </w:pPr>
-      <w:r>
-        <w:rPr>
-          <w:rFonts w:ascii="Times New Roman" w:hAnsi="Times New Roman" w:cs="Times New Roman" w:eastAsia="Times New Roman"/>
-          <w:b w:val="0"/>
-          <w:i w:val="0"/>
-          <w:sz w:val="28"/>
-        </w:rPr>
-        <w:t>3.</w:t>
-        <w:tab/>
-        <w:t>The cross-dataset transferability of the integrated pipeline was evaluated on APTOS 2019 against the pre-registered generalisation criterion G ≥ 0.85.</w:t>
-      </w:r>
-    </w:p>
-    <w:p>
-      <w:pPr>
-        <w:ind w:left="709" w:hanging="397"/>
-        <w:jc w:val="both"/>
-      </w:pPr>
-      <w:r>
-        <w:rPr>
-          <w:rFonts w:ascii="Times New Roman" w:hAnsi="Times New Roman" w:cs="Times New Roman" w:eastAsia="Times New Roman"/>
-          <w:b w:val="0"/>
-          <w:i w:val="0"/>
-          <w:sz w:val="28"/>
-        </w:rPr>
-        <w:t>4.</w:t>
-        <w:tab/>
-        <w:t>Grad-CAM explainability analysis, using the proposed ALO metric (primary) and IoU (secondary) against IDRiD pixel-level lesion masks and qualitative overlays on a Kazakh clinical dataset, characterised the alignment of model attention with clinically relevant lesion structures.</w:t>
-      </w:r>
-    </w:p>
-    <w:p>
-      <w:pPr>
-        <w:ind w:left="709" w:hanging="397"/>
-        <w:jc w:val="both"/>
-      </w:pPr>
-      <w:r>
-        <w:rPr>
-          <w:rFonts w:ascii="Times New Roman" w:hAnsi="Times New Roman" w:cs="Times New Roman" w:eastAsia="Times New Roman"/>
-          <w:b w:val="0"/>
-          <w:i w:val="0"/>
-          <w:sz w:val="28"/>
-        </w:rPr>
-        <w:t>5.</w:t>
-        <w:tab/>
-        <w:t>The clinical degradation resistance of the pipeline was evaluated on IDRiD and Messidor-2, and its device robustness across four camera manufacturers was evaluated on DDR, ODIR-5K, and RFMiD.</w:t>
-      </w:r>
-    </w:p>
-    <w:p>
-      <w:pPr>
-        <w:ind w:left="709" w:hanging="397"/>
-        <w:jc w:val="both"/>
-      </w:pPr>
-      <w:r>
-        <w:rPr>
-          <w:rFonts w:ascii="Times New Roman" w:hAnsi="Times New Roman" w:cs="Times New Roman" w:eastAsia="Times New Roman"/>
-          <w:b w:val="0"/>
-          <w:i w:val="0"/>
-          <w:sz w:val="28"/>
-        </w:rPr>
-        <w:t>6.</w:t>
-        <w:tab/>
-        <w:t>An architecture for an automated DR screening system for resource-limited environments was designed, with telemedicine and eHealth integration applicable to the healthcare infrastructure of the Republic of Kazakhstan.</w:t>
-      </w:r>
-    </w:p>
-    <w:p>
-      <w:pPr>
-        <w:ind w:firstLine="709"/>
-        <w:jc w:val="both"/>
-      </w:pPr>
-      <w:r>
-        <w:rPr>
-          <w:rFonts w:ascii="Times New Roman" w:hAnsi="Times New Roman" w:cs="Times New Roman" w:eastAsia="Times New Roman"/>
-          <w:b w:val="0"/>
-          <w:i w:val="0"/>
-          <w:sz w:val="28"/>
-        </w:rPr>
-        <w:t>The dissertation thus delivers a transferable, interpretable, and device-robust integrated preprocessing-CNN regime for automated diabetic retinopathy diagnosis under constrained computational conditions. The work does not claim global state-of-the-art, clinical device certification, replacement of the ophthalmologist, or cross-modality transfer; these boundaries are stated explicitly.</w:t>
-      </w:r>
-    </w:p>
-    <w:p>
-      <w:pPr>
-        <w:pBdr>
-          <w:bottom w:val="single" w:sz="6" w:space="1" w:color="auto"/>
-        </w:pBdr>
-      </w:pPr>
-    </w:p>
-    <w:p>
-      <w:pPr>
-        <w:keepNext/>
-        <w:spacing w:before="240" w:after="120"/>
-        <w:jc w:val="center"/>
-      </w:pPr>
-      <w:r>
-        <w:rPr>
-          <w:rFonts w:ascii="Times New Roman" w:hAnsi="Times New Roman" w:cs="Times New Roman" w:eastAsia="Times New Roman"/>
-          <w:b/>
-          <w:i w:val="0"/>
-          <w:sz w:val="32"/>
-        </w:rPr>
-        <w:t>LIST OF PUBLISHED WORKS ON THE DISSERTATION TOPIC</w:t>
+        <w:t>).</w:t>
       </w:r>
     </w:p>
     <w:p>
@@ -1582,6 +1243,252 @@
         <w:t>5.</w:t>
         <w:tab/>
         <w:t>Sapakova S.Z., Daniyarova D.R., Yesmukhamedov N.S., Armankyzy R., Yemberdiyeva A.B., Kaldybaeva A.S. Mathematical modeling of laser exposure on fundus tissues in the treatment of diabetic retinopathy // Herald of KazUTB. — 2024. — Vol. 2, No. 27-740. https://doi.org/10.58805/kazutb.v.2.27-740</w:t>
+      </w:r>
+    </w:p>
+    <w:p>
+      <w:pPr>
+        <w:keepNext/>
+        <w:spacing w:before="240" w:after="120"/>
+        <w:jc w:val="left"/>
+      </w:pPr>
+      <w:r>
+        <w:rPr>
+          <w:rFonts w:ascii="Times New Roman" w:hAnsi="Times New Roman" w:cs="Times New Roman" w:eastAsia="Times New Roman"/>
+          <w:b/>
+          <w:i w:val="0"/>
+          <w:sz w:val="28"/>
+        </w:rPr>
+        <w:t>Main content of the work</w:t>
+      </w:r>
+    </w:p>
+    <w:p>
+      <w:pPr>
+        <w:ind w:firstLine="709"/>
+        <w:jc w:val="both"/>
+      </w:pPr>
+      <w:r>
+        <w:rPr>
+          <w:rFonts w:ascii="Times New Roman" w:hAnsi="Times New Roman" w:cs="Times New Roman" w:eastAsia="Times New Roman"/>
+          <w:b/>
+          <w:i w:val="0"/>
+          <w:sz w:val="28"/>
+        </w:rPr>
+        <w:t>The introduction</w:t>
+      </w:r>
+      <w:r>
+        <w:rPr>
+          <w:rFonts w:ascii="Times New Roman" w:hAnsi="Times New Roman" w:cs="Times New Roman" w:eastAsia="Times New Roman"/>
+          <w:b w:val="0"/>
+          <w:i w:val="0"/>
+          <w:sz w:val="28"/>
+        </w:rPr>
+        <w:t xml:space="preserve"> substantiates the relevance of the topic, formulates the aim, objectives, object and subject of the research, the central hypothesis, the scientific novelty, the statements submitted for defense, the methodological basis, the theoretical and practical significance, the reliability of the results, the empirical basis, the approbation, the connection with scientific programmes, and the publications, and describes the structure and length of the dissertation.</w:t>
+      </w:r>
+    </w:p>
+    <w:p>
+      <w:pPr>
+        <w:ind w:firstLine="709"/>
+        <w:jc w:val="both"/>
+      </w:pPr>
+      <w:r>
+        <w:rPr>
+          <w:rFonts w:ascii="Times New Roman" w:hAnsi="Times New Roman" w:cs="Times New Roman" w:eastAsia="Times New Roman"/>
+          <w:b/>
+          <w:i w:val="0"/>
+          <w:sz w:val="28"/>
+        </w:rPr>
+        <w:t>Chapter 1 — "Problem Domain Analysis and Current State of Automated Diabetic Retinopathy Diagnosis"</w:t>
+      </w:r>
+      <w:r>
+        <w:rPr>
+          <w:rFonts w:ascii="Times New Roman" w:hAnsi="Times New Roman" w:cs="Times New Roman" w:eastAsia="Times New Roman"/>
+          <w:b w:val="0"/>
+          <w:i w:val="0"/>
+          <w:sz w:val="28"/>
+        </w:rPr>
+        <w:t xml:space="preserve"> examines the medical and epidemiological context of DR and its clinical grading, the screening requirements of resource-limited settings, the sources of fundus image quality degradation and device-specific variability, deep-learning approaches to retinal image classification (CNN architectures, transfer and self-supervised pretraining, explainability), and provides a critical analysis of existing automated DR screening systems, concluding with the formulation of the research problem and the justification of the research direction.</w:t>
+      </w:r>
+    </w:p>
+    <w:p>
+      <w:pPr>
+        <w:ind w:firstLine="709"/>
+        <w:jc w:val="both"/>
+      </w:pPr>
+      <w:r>
+        <w:rPr>
+          <w:rFonts w:ascii="Times New Roman" w:hAnsi="Times New Roman" w:cs="Times New Roman" w:eastAsia="Times New Roman"/>
+          <w:b/>
+          <w:i w:val="0"/>
+          <w:sz w:val="28"/>
+        </w:rPr>
+        <w:t>Chapter 2 — "Theoretical Foundations of Image Preprocessing and Deep Learning for Fundus Image Analysis"</w:t>
+      </w:r>
+      <w:r>
+        <w:rPr>
+          <w:rFonts w:ascii="Times New Roman" w:hAnsi="Times New Roman" w:cs="Times New Roman" w:eastAsia="Times New Roman"/>
+          <w:b w:val="0"/>
+          <w:i w:val="0"/>
+          <w:sz w:val="28"/>
+        </w:rPr>
+        <w:t xml:space="preserve"> establishes the mathematical foundations of image enhancement (histogram equalisation, dual-constraint CLAHE, spatial filtering), the theoretical framework of CNNs (convolution, pooling, loss functions for imbalanced data, regularisation), transfer and in-domain self-supervised representation learning, the mathematical modelling of laser-tissue interaction in retinal therapy, explainability (CAM, Grad-CAM, ALO, IoU), and image quality metrics for preprocessing evaluation.</w:t>
+      </w:r>
+    </w:p>
+    <w:p>
+      <w:pPr>
+        <w:ind w:firstLine="709"/>
+        <w:jc w:val="both"/>
+      </w:pPr>
+      <w:r>
+        <w:rPr>
+          <w:rFonts w:ascii="Times New Roman" w:hAnsi="Times New Roman" w:cs="Times New Roman" w:eastAsia="Times New Roman"/>
+          <w:b/>
+          <w:i w:val="0"/>
+          <w:sz w:val="28"/>
+        </w:rPr>
+        <w:t>Chapter 3 — "Methodology of Integrated Preprocessing-CNN Pipeline Design"</w:t>
+      </w:r>
+      <w:r>
+        <w:rPr>
+          <w:rFonts w:ascii="Times New Roman" w:hAnsi="Times New Roman" w:cs="Times New Roman" w:eastAsia="Times New Roman"/>
+          <w:b w:val="0"/>
+          <w:i w:val="0"/>
+          <w:sz w:val="28"/>
+        </w:rPr>
+        <w:t xml:space="preserve"> formalises the unified 8-stage preprocessing pipeline and the modified dual-constraint CLAHE algorithm, the augmentation strategy, and the external image ingestion protocol; specifies the CNN architectures (ResNet-50 and EfficientNet-B3); details the transfer-learning and ophthalmology-specific self-supervised pretraining methodology, the architecture adaptation for five-class classification, and the weighted (Focal) loss formulation; and defines the multi-metric evaluation and statistical reliability framework.</w:t>
+      </w:r>
+    </w:p>
+    <w:p>
+      <w:pPr>
+        <w:ind w:firstLine="709"/>
+        <w:jc w:val="both"/>
+      </w:pPr>
+      <w:r>
+        <w:rPr>
+          <w:rFonts w:ascii="Times New Roman" w:hAnsi="Times New Roman" w:cs="Times New Roman" w:eastAsia="Times New Roman"/>
+          <w:b/>
+          <w:i w:val="0"/>
+          <w:sz w:val="28"/>
+        </w:rPr>
+        <w:t>Chapter 4 — "Experimental Research — Preprocessing Impact on CNN Diagnostic Performance"</w:t>
+      </w:r>
+      <w:r>
+        <w:rPr>
+          <w:rFonts w:ascii="Times New Roman" w:hAnsi="Times New Roman" w:cs="Times New Roman" w:eastAsia="Times New Roman"/>
+          <w:b w:val="0"/>
+          <w:i w:val="0"/>
+          <w:sz w:val="28"/>
+        </w:rPr>
+        <w:t xml:space="preserve"> presents the tiered dataset architecture and the seven experiments: Experiment 1 (integrated-pipeline dominance via a restored 2×2 factorial, configs A–D), Experiment 2 (stage ablation across 7 levels, CLAHE threshold and flat-field σ sweeps with image-quality metrics), Experiment 3 (zero-shot cross-dataset transfer to APTOS 2019), Experiment 4 (Grad-CAM explainability with quantitative ALO/IoU on IDRiD and qualitative overlays on the Clinical dataset), Experiment 5 (clinical degradation resistance on IDRiD and Messidor-2), Experiment 6 (device domain shift on DDR, ODIR-5K, RFMiD), and Experiment 7 (small-data training on IDRiD with the Clinical dataset held out).</w:t>
+      </w:r>
+    </w:p>
+    <w:p>
+      <w:pPr>
+        <w:ind w:firstLine="709"/>
+        <w:jc w:val="both"/>
+      </w:pPr>
+      <w:r>
+        <w:rPr>
+          <w:rFonts w:ascii="Times New Roman" w:hAnsi="Times New Roman" w:cs="Times New Roman" w:eastAsia="Times New Roman"/>
+          <w:b/>
+          <w:i w:val="0"/>
+          <w:sz w:val="28"/>
+        </w:rPr>
+        <w:t>Chapter 5 — "Reliability Validation and Comparative Analysis"</w:t>
+      </w:r>
+      <w:r>
+        <w:rPr>
+          <w:rFonts w:ascii="Times New Roman" w:hAnsi="Times New Roman" w:cs="Times New Roman" w:eastAsia="Times New Roman"/>
+          <w:b w:val="0"/>
+          <w:i w:val="0"/>
+          <w:sz w:val="28"/>
+        </w:rPr>
+        <w:t xml:space="preserve"> consolidates the explainability results, the statistical validation (bootstrap confidence intervals and mixed-effects modelling, final claim-strength classifications), the comparative analysis against published systems (IDx-DR, Eyenuk, DeepMind) and the performance-complexity trade-off, and states the limitations and boundary conditions of the proposed approach.</w:t>
+      </w:r>
+    </w:p>
+    <w:p>
+      <w:pPr>
+        <w:ind w:firstLine="709"/>
+        <w:jc w:val="both"/>
+      </w:pPr>
+      <w:r>
+        <w:rPr>
+          <w:rFonts w:ascii="Times New Roman" w:hAnsi="Times New Roman" w:cs="Times New Roman" w:eastAsia="Times New Roman"/>
+          <w:b/>
+          <w:i w:val="0"/>
+          <w:sz w:val="28"/>
+        </w:rPr>
+        <w:t>Chapter 6 — "Architecture of an Automated DR Screening System for Resource-Limited Environments"</w:t>
+      </w:r>
+      <w:r>
+        <w:rPr>
+          <w:rFonts w:ascii="Times New Roman" w:hAnsi="Times New Roman" w:cs="Times New Roman" w:eastAsia="Times New Roman"/>
+          <w:b w:val="0"/>
+          <w:i w:val="0"/>
+          <w:sz w:val="28"/>
+        </w:rPr>
+        <w:t xml:space="preserve"> specifies the functional and non-functional requirements, the modular architecture with PACS and EHR integration, the AI processing module (configurable preprocessing engine and inference module), clinical workflow integration (telemedicine, portable-device and national eHealth-platform support, physician-in-the-loop decision support), and the data security and regulatory-compliance framework (GDPR/HIPAA-aligned), with its applicability to Kazakhstan healthcare infrastructure.</w:t>
+      </w:r>
+    </w:p>
+    <w:p>
+      <w:pPr>
+        <w:keepNext/>
+        <w:spacing w:before="240" w:after="120"/>
+        <w:jc w:val="left"/>
+      </w:pPr>
+      <w:r>
+        <w:rPr>
+          <w:rFonts w:ascii="Times New Roman" w:hAnsi="Times New Roman" w:cs="Times New Roman" w:eastAsia="Times New Roman"/>
+          <w:b/>
+          <w:i w:val="0"/>
+          <w:sz w:val="28"/>
+        </w:rPr>
+        <w:t>Author's personal contribution</w:t>
+      </w:r>
+    </w:p>
+    <w:p>
+      <w:pPr>
+        <w:ind w:firstLine="709"/>
+        <w:jc w:val="both"/>
+      </w:pPr>
+      <w:r>
+        <w:rPr>
+          <w:rFonts w:ascii="Times New Roman" w:hAnsi="Times New Roman" w:cs="Times New Roman" w:eastAsia="Times New Roman"/>
+          <w:b w:val="0"/>
+          <w:i w:val="0"/>
+          <w:sz w:val="28"/>
+        </w:rPr>
+        <w:t>The principal results of the dissertation were obtained by the author personally: the conceptual reframing of preprocessing as an integral component of the diagnostic model (paradigm P2); the design and formal specification of the 8-stage preprocessing pipeline, including the dual-constraint stochastic CLAHE, the adaptive flat-field correction, and the FOV-mask input channel; the Attention–Lesion Overlap (ALO) explainability metric; the controlled experimental design and statistical validation framework; and the architecture of the automated DR screening system. In the joint publications the author developed the fundus image preprocessing and analysis methods and prepared the corresponding parts of the manuscripts.</w:t>
+      </w:r>
+    </w:p>
+    <w:p>
+      <w:pPr>
+        <w:keepNext/>
+        <w:spacing w:before="240" w:after="120"/>
+        <w:jc w:val="left"/>
+      </w:pPr>
+      <w:r>
+        <w:rPr>
+          <w:rFonts w:ascii="Times New Roman" w:hAnsi="Times New Roman" w:cs="Times New Roman" w:eastAsia="Times New Roman"/>
+          <w:b/>
+          <w:i w:val="0"/>
+          <w:sz w:val="28"/>
+        </w:rPr>
+        <w:t>Structure and length of the dissertation</w:t>
+      </w:r>
+    </w:p>
+    <w:p>
+      <w:pPr>
+        <w:ind w:firstLine="709"/>
+        <w:jc w:val="both"/>
+      </w:pPr>
+      <w:r>
+        <w:rPr>
+          <w:rFonts w:ascii="Times New Roman" w:hAnsi="Times New Roman" w:cs="Times New Roman" w:eastAsia="Times New Roman"/>
+          <w:b w:val="0"/>
+          <w:i w:val="0"/>
+          <w:sz w:val="28"/>
+        </w:rPr>
+        <w:t>The dissertation consists of an introduction, six chapters, a conclusion, a list of references used, and appendices. The work is supplemented with tables, figures, and the source code of the preprocessing pipeline.</w:t>
       </w:r>
     </w:p>
     <w:sectPr>

</xml_diff>